<commit_message>
Updated README and SQL Queries md.
</commit_message>
<xml_diff>
--- a/GP DNA Portfolio Case Study.docx
+++ b/GP DNA Portfolio Case Study.docx
@@ -57,29 +57,7 @@
           <w:sz w:val="52"/>
           <w:szCs w:val="52"/>
         </w:rPr>
-        <w:t xml:space="preserve">The DNA Problem: Regional Variation, Appointment Friction </w:t>
-      </w:r>
-      <w:proofErr w:type="gramStart"/>
-      <w:r>
-        <w:rPr>
-          <w:b/>
-          <w:bCs/>
-          <w:color w:val="0070C0"/>
-          <w:sz w:val="52"/>
-          <w:szCs w:val="52"/>
-        </w:rPr>
-        <w:t>and  the</w:t>
-      </w:r>
-      <w:proofErr w:type="gramEnd"/>
-      <w:r>
-        <w:rPr>
-          <w:b/>
-          <w:bCs/>
-          <w:color w:val="0070C0"/>
-          <w:sz w:val="52"/>
-          <w:szCs w:val="52"/>
-        </w:rPr>
-        <w:t xml:space="preserve"> Deprivation Myth in NHS Primary Care</w:t>
+        <w:t>The DNA Problem: Regional Variation, Appointment Friction and  the Deprivation Myth in NHS Primary Care</w:t>
       </w:r>
     </w:p>
     <w:p>
@@ -417,7 +395,6 @@
             </w:tcMar>
           </w:tcPr>
           <w:p>
-            <w:proofErr w:type="gramStart"/>
             <w:r>
               <w:rPr>
                 <w:sz w:val="20"/>
@@ -437,15 +414,7 @@
                 <w:sz w:val="20"/>
                 <w:szCs w:val="20"/>
               </w:rPr>
-              <w:t>|</w:t>
-            </w:r>
-            <w:proofErr w:type="gramEnd"/>
-            <w:r>
-              <w:rPr>
-                <w:sz w:val="20"/>
-                <w:szCs w:val="20"/>
-              </w:rPr>
-              <w:t xml:space="preserve">  Microsoft Excel</w:t>
+              <w:t>|  Microsoft Excel</w:t>
             </w:r>
           </w:p>
         </w:tc>
@@ -504,23 +473,7 @@
                 <w:sz w:val="20"/>
                 <w:szCs w:val="20"/>
               </w:rPr>
-              <w:t xml:space="preserve">NHS </w:t>
-            </w:r>
-            <w:proofErr w:type="gramStart"/>
-            <w:r>
-              <w:rPr>
-                <w:sz w:val="20"/>
-                <w:szCs w:val="20"/>
-              </w:rPr>
-              <w:t>England  |</w:t>
-            </w:r>
-            <w:proofErr w:type="gramEnd"/>
-            <w:r>
-              <w:rPr>
-                <w:sz w:val="20"/>
-                <w:szCs w:val="20"/>
-              </w:rPr>
-              <w:t xml:space="preserve">  DLUHC / ONS (English Indices of Deprivation 2019)</w:t>
+              <w:t>NHS England  |  DLUHC / ONS (English Indices of Deprivation 2019)</w:t>
             </w:r>
           </w:p>
         </w:tc>
@@ -740,29 +693,7 @@
                 <w:sz w:val="20"/>
                 <w:szCs w:val="20"/>
               </w:rPr>
-              <w:t xml:space="preserve">KEY FINDING </w:t>
-            </w:r>
-            <w:proofErr w:type="gramStart"/>
-            <w:r>
-              <w:rPr>
-                <w:b/>
-                <w:bCs/>
-                <w:color w:val="005EB8"/>
-                <w:sz w:val="20"/>
-                <w:szCs w:val="20"/>
-              </w:rPr>
-              <w:t>1  —</w:t>
-            </w:r>
-            <w:proofErr w:type="gramEnd"/>
-            <w:r>
-              <w:rPr>
-                <w:b/>
-                <w:bCs/>
-                <w:color w:val="005EB8"/>
-                <w:sz w:val="20"/>
-                <w:szCs w:val="20"/>
-              </w:rPr>
-              <w:t xml:space="preserve">  Geographic Variation</w:t>
+              <w:t>KEY FINDING 1  —  Geographic Variation</w:t>
             </w:r>
           </w:p>
           <w:p>
@@ -774,23 +705,7 @@
                 <w:sz w:val="20"/>
                 <w:szCs w:val="20"/>
               </w:rPr>
-              <w:t xml:space="preserve">DNA rates vary significantly across England, with London (12.15%) and the </w:t>
-            </w:r>
-            <w:proofErr w:type="gramStart"/>
-            <w:r>
-              <w:rPr>
-                <w:sz w:val="20"/>
-                <w:szCs w:val="20"/>
-              </w:rPr>
-              <w:t>North West</w:t>
-            </w:r>
-            <w:proofErr w:type="gramEnd"/>
-            <w:r>
-              <w:rPr>
-                <w:sz w:val="20"/>
-                <w:szCs w:val="20"/>
-              </w:rPr>
-              <w:t xml:space="preserve"> (11.84%) emerging as the primary hotspots. The national average of approximately 4.8% conceals a Sub-ICB spread from 0.00% to 32.84% — a 96-location distribution where roughly half of Sub-ICBs exceed 8%.</w:t>
+              <w:t>DNA rates vary significantly across England, with London (12.15%) and the North West (11.84%) emerging as the primary hotspots. The national average of approximately 4.8% conceals a Sub-ICB spread from 0.00% to 32.84% — a 96-location distribution where roughly half of Sub-ICBs exceed 8%.</w:t>
             </w:r>
           </w:p>
           <w:p>
@@ -802,23 +717,7 @@
                 <w:sz w:val="20"/>
                 <w:szCs w:val="20"/>
               </w:rPr>
-              <w:t xml:space="preserve">This variation is not random. Regional concentration in London and the </w:t>
-            </w:r>
-            <w:proofErr w:type="gramStart"/>
-            <w:r>
-              <w:rPr>
-                <w:sz w:val="20"/>
-                <w:szCs w:val="20"/>
-              </w:rPr>
-              <w:t>North West</w:t>
-            </w:r>
-            <w:proofErr w:type="gramEnd"/>
-            <w:r>
-              <w:rPr>
-                <w:sz w:val="20"/>
-                <w:szCs w:val="20"/>
-              </w:rPr>
-              <w:t>, combined with clustering of high-rate Sub-ICBs within those regions, points to structural and operational factors rather than patient-level behaviour alone.</w:t>
+              <w:t>This variation is not random. Regional concentration in London and the North West, combined with clustering of high-rate Sub-ICBs within those regions, points to structural and operational factors rather than patient-level behaviour alone.</w:t>
             </w:r>
           </w:p>
         </w:tc>
@@ -880,29 +779,7 @@
                 <w:sz w:val="20"/>
                 <w:szCs w:val="20"/>
               </w:rPr>
-              <w:t xml:space="preserve">KEY FINDING </w:t>
-            </w:r>
-            <w:proofErr w:type="gramStart"/>
-            <w:r>
-              <w:rPr>
-                <w:b/>
-                <w:bCs/>
-                <w:color w:val="009639"/>
-                <w:sz w:val="20"/>
-                <w:szCs w:val="20"/>
-              </w:rPr>
-              <w:t>2  —</w:t>
-            </w:r>
-            <w:proofErr w:type="gramEnd"/>
-            <w:r>
-              <w:rPr>
-                <w:b/>
-                <w:bCs/>
-                <w:color w:val="009639"/>
-                <w:sz w:val="20"/>
-                <w:szCs w:val="20"/>
-              </w:rPr>
-              <w:t xml:space="preserve">  Appointment Mode and Friction</w:t>
+              <w:t>KEY FINDING 2  —  Appointment Mode and Friction</w:t>
             </w:r>
           </w:p>
           <w:p>
@@ -914,23 +791,7 @@
                 <w:sz w:val="20"/>
                 <w:szCs w:val="20"/>
               </w:rPr>
-              <w:t xml:space="preserve">Face-to-face appointments carry the highest DNA rate (10.65%) — more than 5 times higher than video/online appointments (1.94%) and </w:t>
-            </w:r>
-            <w:proofErr w:type="gramStart"/>
-            <w:r>
-              <w:rPr>
-                <w:sz w:val="20"/>
-                <w:szCs w:val="20"/>
-              </w:rPr>
-              <w:t>nearly twice</w:t>
-            </w:r>
-            <w:proofErr w:type="gramEnd"/>
-            <w:r>
-              <w:rPr>
-                <w:sz w:val="20"/>
-                <w:szCs w:val="20"/>
-              </w:rPr>
-              <w:t xml:space="preserve"> the telephone rate (5.77%). The post-COVID shift toward remote and digital consultations has not increased missed appointments; it has reduced them.</w:t>
+              <w:t>Face-to-face appointments carry the highest DNA rate (10.65%) — more than 5 times higher than video/online appointments (1.94%) and nearly twice the telephone rate (5.77%). The post-COVID shift toward remote and digital consultations has not increased missed appointments; it has reduced them.</w:t>
             </w:r>
           </w:p>
           <w:p>
@@ -942,23 +803,7 @@
                 <w:sz w:val="20"/>
                 <w:szCs w:val="20"/>
               </w:rPr>
-              <w:t xml:space="preserve">This pattern is consistent across all seven NHS regions, suggesting a systemic mechanism rather than a regional anomaly. The most plausible explanation is cancellation friction: telephone and digital appointments are easier to quietly ignore, but face-to-face bookings carry a stronger psychological commitment — making a person more likely to cancel rather than simply not attend. Video/online appointments have grown </w:t>
-            </w:r>
-            <w:proofErr w:type="gramStart"/>
-            <w:r>
-              <w:rPr>
-                <w:sz w:val="20"/>
-                <w:szCs w:val="20"/>
-              </w:rPr>
-              <w:t>nearly 10-fold</w:t>
-            </w:r>
-            <w:proofErr w:type="gramEnd"/>
-            <w:r>
-              <w:rPr>
-                <w:sz w:val="20"/>
-                <w:szCs w:val="20"/>
-              </w:rPr>
-              <w:t xml:space="preserve"> since July 2022 (0.58% to 5.54% of all appointments), representing a significant and underutilised lever for reducing DNAs further.</w:t>
+              <w:t>This pattern is consistent across all seven NHS regions, suggesting a systemic mechanism rather than a regional anomaly. The most plausible explanation is cancellation friction: telephone and digital appointments are easier to quietly ignore, but face-to-face bookings carry a stronger psychological commitment — making a person more likely to cancel rather than simply not attend. Video/online appointments have grown nearly 10-fold since July 2022 (0.58% to 5.54% of all appointments), representing a significant and underutilised lever for reducing DNAs further.</w:t>
             </w:r>
           </w:p>
         </w:tc>
@@ -1020,29 +865,7 @@
                 <w:sz w:val="20"/>
                 <w:szCs w:val="20"/>
               </w:rPr>
-              <w:t xml:space="preserve">KEY FINDING </w:t>
-            </w:r>
-            <w:proofErr w:type="gramStart"/>
-            <w:r>
-              <w:rPr>
-                <w:b/>
-                <w:bCs/>
-                <w:color w:val="ED8B00"/>
-                <w:sz w:val="20"/>
-                <w:szCs w:val="20"/>
-              </w:rPr>
-              <w:t>3  —</w:t>
-            </w:r>
-            <w:proofErr w:type="gramEnd"/>
-            <w:r>
-              <w:rPr>
-                <w:b/>
-                <w:bCs/>
-                <w:color w:val="ED8B00"/>
-                <w:sz w:val="20"/>
-                <w:szCs w:val="20"/>
-              </w:rPr>
-              <w:t xml:space="preserve">  Deprivation and Access Inequality</w:t>
+              <w:t>KEY FINDING 3  —  Deprivation and Access Inequality</w:t>
             </w:r>
           </w:p>
           <w:p>
@@ -1054,23 +877,7 @@
                 <w:sz w:val="20"/>
                 <w:szCs w:val="20"/>
               </w:rPr>
-              <w:t xml:space="preserve">Contrary to the assumption that underpins </w:t>
-            </w:r>
-            <w:proofErr w:type="gramStart"/>
-            <w:r>
-              <w:rPr>
-                <w:sz w:val="20"/>
-                <w:szCs w:val="20"/>
-              </w:rPr>
-              <w:t>much</w:t>
-            </w:r>
-            <w:proofErr w:type="gramEnd"/>
-            <w:r>
-              <w:rPr>
-                <w:sz w:val="20"/>
-                <w:szCs w:val="20"/>
-              </w:rPr>
-              <w:t xml:space="preserve"> NHS access inequality literature, the least deprived areas (IMD bands 9–10) show the highest average DNA rate in this dataset (7.40%), compared to 6.12% in the most deprived areas analysed (bands 5–6).</w:t>
+              <w:t>Contrary to the assumption that underpins much NHS access inequality literature, the least deprived areas (IMD bands 9–10) show the highest average DNA rate in this dataset (7.40%), compared to 6.12% in the most deprived areas analysed (bands 5–6).</w:t>
             </w:r>
           </w:p>
           <w:p>
@@ -1102,15 +909,7 @@
       </w:r>
       <w:r>
         <w:lastRenderedPageBreak/>
-        <w:t xml:space="preserve">rate regions rather than the most </w:t>
-      </w:r>
-      <w:proofErr w:type="gramStart"/>
-      <w:r>
-        <w:t>deprived, and</w:t>
-      </w:r>
-      <w:proofErr w:type="gramEnd"/>
-      <w:r>
-        <w:t xml:space="preserve"> commissioning a more granular deprivation analysis that controls for mode mix and urban classification.</w:t>
+        <w:t>rate regions rather than the most deprived, and commissioning a more granular deprivation analysis that controls for mode mix and urban classification.</w:t>
       </w:r>
     </w:p>
     <w:p>
@@ -1144,7 +943,6 @@
         </w:pBdr>
         <w:spacing w:before="280" w:after="120"/>
       </w:pPr>
-      <w:proofErr w:type="gramStart"/>
       <w:r>
         <w:rPr>
           <w:b/>
@@ -1153,9 +951,40 @@
           <w:sz w:val="24"/>
           <w:szCs w:val="24"/>
         </w:rPr>
-        <w:t>2.1  The</w:t>
-      </w:r>
-      <w:proofErr w:type="gramEnd"/>
+        <w:t>2.1  The NHS Primary Care Challenge</w:t>
+      </w:r>
+    </w:p>
+    <w:p>
+      <w:pPr>
+        <w:spacing w:before="80" w:after="100"/>
+      </w:pPr>
+      <w:r>
+        <w:t>GP appointment DNA rates represent one of the most persistent and costly inefficiencies in NHS primary care. Each missed appointment occupies a slot that could have served another patient, contributing to the backlog of unmet demand that has intensified since the COVID-19 pandemic. NHS England estimates the annual cost of missed GP appointments at over £1 billion, with DNA rates consistently running above 5% of all booked appointments.</w:t>
+      </w:r>
+    </w:p>
+    <w:p>
+      <w:pPr>
+        <w:spacing w:before="80" w:after="100"/>
+      </w:pPr>
+      <w:r>
+        <w:t>The pandemic triggered a fundamental shift in how GP appointments are delivered — from a predominantly face-to-face model to a mixed model incorporating telephone, video, and online channels. The NHS Long Term Plan explicitly encouraged this shift as part of its primary care access strategy. However, the effect of this mode shift on attendance behaviour has been underexplored in published primary care analytics. A widely held assumption — that remote appointments are harder to attend, and therefore associated with higher DNA rates — has rarely been tested against systematic data.</w:t>
+      </w:r>
+    </w:p>
+    <w:p>
+      <w:pPr>
+        <w:spacing w:before="80" w:after="100"/>
+      </w:pPr>
+      <w:r>
+        <w:t>This project addresses that gap, using NHS England's own published datasets to examine whether the post-pandemic mode shift has helped or harmed attendance rates, and where the greatest opportunities for DNA reduction lie.</w:t>
+      </w:r>
+    </w:p>
+    <w:p>
+      <w:pPr>
+        <w:pBdr>
+          <w:bottom w:val="single" w:sz="4" w:space="4" w:color="005EB8"/>
+        </w:pBdr>
+        <w:spacing w:before="280" w:after="120"/>
+      </w:pPr>
       <w:r>
         <w:rPr>
           <w:b/>
@@ -1164,7 +993,7 @@
           <w:sz w:val="24"/>
           <w:szCs w:val="24"/>
         </w:rPr>
-        <w:t xml:space="preserve"> NHS Primary Care Challenge</w:t>
+        <w:t>2.2  Research Questions</w:t>
       </w:r>
     </w:p>
     <w:p>
@@ -1172,117 +1001,7 @@
         <w:spacing w:before="80" w:after="100"/>
       </w:pPr>
       <w:r>
-        <w:t>GP appointment DNA rates represent one of the most persistent and costly inefficiencies in NHS primary care. Each missed appointment occupies a slot that could have served another patient, contributing to the backlog of unmet demand that has intensified since the COVID-19 pandemic. NHS England estimates the annual cost of missed GP appointments at over £1 billion, with DNA rates consistently running above 5% of all booked appointments.</w:t>
-      </w:r>
-    </w:p>
-    <w:p>
-      <w:pPr>
-        <w:spacing w:before="80" w:after="100"/>
-      </w:pPr>
-      <w:r>
-        <w:t xml:space="preserve">The pandemic triggered a fundamental shift in how GP appointments </w:t>
-      </w:r>
-      <w:proofErr w:type="gramStart"/>
-      <w:r>
-        <w:t>are delivered</w:t>
-      </w:r>
-      <w:proofErr w:type="gramEnd"/>
-      <w:r>
-        <w:t xml:space="preserve"> — from a </w:t>
-      </w:r>
-      <w:proofErr w:type="gramStart"/>
-      <w:r>
-        <w:t>predominantly face-to-face</w:t>
-      </w:r>
-      <w:proofErr w:type="gramEnd"/>
-      <w:r>
-        <w:t xml:space="preserve"> model to a mixed model incorporating telephone, video, and online channels. The NHS Long Term Plan explicitly encouraged this shift as part of its primary care access strategy. However, the effect of this mode shift on attendance behaviour has been underexplored in published primary care analytics. A widely held assumption — that remote appointments are harder to </w:t>
-      </w:r>
-      <w:proofErr w:type="gramStart"/>
-      <w:r>
-        <w:t>attend, and</w:t>
-      </w:r>
-      <w:proofErr w:type="gramEnd"/>
-      <w:r>
-        <w:t xml:space="preserve"> therefore associated with higher DNA rates — has rarely been </w:t>
-      </w:r>
-      <w:proofErr w:type="gramStart"/>
-      <w:r>
-        <w:t>tested</w:t>
-      </w:r>
-      <w:proofErr w:type="gramEnd"/>
-      <w:r>
-        <w:t xml:space="preserve"> against systematic data.</w:t>
-      </w:r>
-    </w:p>
-    <w:p>
-      <w:pPr>
-        <w:spacing w:before="80" w:after="100"/>
-      </w:pPr>
-      <w:r>
-        <w:t>This project addresses that gap, using NHS England's own published datasets to examine whether the post-pandemic mode shift has helped or harmed attendance rates, and where the greatest opportunities for DNA reduction lie.</w:t>
-      </w:r>
-    </w:p>
-    <w:p>
-      <w:pPr>
-        <w:pBdr>
-          <w:bottom w:val="single" w:sz="4" w:space="4" w:color="005EB8"/>
-        </w:pBdr>
-        <w:spacing w:before="280" w:after="120"/>
-      </w:pPr>
-      <w:proofErr w:type="gramStart"/>
-      <w:r>
-        <w:rPr>
-          <w:b/>
-          <w:bCs/>
-          <w:color w:val="003087"/>
-          <w:sz w:val="24"/>
-          <w:szCs w:val="24"/>
-        </w:rPr>
-        <w:t>2.2  Research</w:t>
-      </w:r>
-      <w:proofErr w:type="gramEnd"/>
-      <w:r>
-        <w:rPr>
-          <w:b/>
-          <w:bCs/>
-          <w:color w:val="003087"/>
-          <w:sz w:val="24"/>
-          <w:szCs w:val="24"/>
-        </w:rPr>
-        <w:t xml:space="preserve"> Questions</w:t>
-      </w:r>
-    </w:p>
-    <w:p>
-      <w:pPr>
-        <w:spacing w:before="80" w:after="100"/>
-      </w:pPr>
-      <w:r>
-        <w:t xml:space="preserve">This analysis </w:t>
-      </w:r>
-      <w:proofErr w:type="gramStart"/>
-      <w:r>
-        <w:t>is structured</w:t>
-      </w:r>
-      <w:proofErr w:type="gramEnd"/>
-      <w:r>
-        <w:t xml:space="preserve"> around three research questions. The original questions </w:t>
-      </w:r>
-      <w:proofErr w:type="gramStart"/>
-      <w:r>
-        <w:t>were refined</w:t>
-      </w:r>
-      <w:proofErr w:type="gramEnd"/>
-      <w:r>
-        <w:t xml:space="preserve"> mid-project after preliminary data analysis revealed that the initial framing contained embedded assumptions that the data contradicted. The revised questions are more diagnostic and more honest to what the evidence </w:t>
-      </w:r>
-      <w:proofErr w:type="gramStart"/>
-      <w:r>
-        <w:t>actually supports</w:t>
-      </w:r>
-      <w:proofErr w:type="gramEnd"/>
-      <w:r>
-        <w:t>.</w:t>
+        <w:t>This analysis is structured around three research questions. The original questions were refined mid-project after preliminary data analysis revealed that the initial framing contained embedded assumptions that the data contradicted. The revised questions are more diagnostic and more honest to what the evidence actually supports.</w:t>
       </w:r>
     </w:p>
     <w:p>
@@ -1562,23 +1281,7 @@
                 <w:sz w:val="20"/>
                 <w:szCs w:val="20"/>
               </w:rPr>
-              <w:t xml:space="preserve">Does reducing appointment friction through remote and digital modes lower DNA rates, and how much of the regional variation can </w:t>
-            </w:r>
-            <w:proofErr w:type="gramStart"/>
-            <w:r>
-              <w:rPr>
-                <w:sz w:val="20"/>
-                <w:szCs w:val="20"/>
-              </w:rPr>
-              <w:t>be explained</w:t>
-            </w:r>
-            <w:proofErr w:type="gramEnd"/>
-            <w:r>
-              <w:rPr>
-                <w:sz w:val="20"/>
-                <w:szCs w:val="20"/>
-              </w:rPr>
-              <w:t xml:space="preserve"> by mode mix differences?</w:t>
+              <w:t>Does reducing appointment friction through remote and digital modes lower DNA rates, and how much of the regional variation can be explained by mode mix differences?</w:t>
             </w:r>
           </w:p>
         </w:tc>
@@ -1682,7 +1385,6 @@
         </w:pBdr>
         <w:spacing w:before="280" w:after="120"/>
       </w:pPr>
-      <w:proofErr w:type="gramStart"/>
       <w:r>
         <w:rPr>
           <w:b/>
@@ -1691,18 +1393,7 @@
           <w:sz w:val="24"/>
           <w:szCs w:val="24"/>
         </w:rPr>
-        <w:t>2.3  Relevance</w:t>
-      </w:r>
-      <w:proofErr w:type="gramEnd"/>
-      <w:r>
-        <w:rPr>
-          <w:b/>
-          <w:bCs/>
-          <w:color w:val="003087"/>
-          <w:sz w:val="24"/>
-          <w:szCs w:val="24"/>
-        </w:rPr>
-        <w:t xml:space="preserve"> to NHS England Priorities</w:t>
+        <w:t>2.3  Relevance to NHS England Priorities</w:t>
       </w:r>
     </w:p>
     <w:p>
@@ -1744,7 +1435,6 @@
         </w:pBdr>
         <w:spacing w:before="280" w:after="120"/>
       </w:pPr>
-      <w:proofErr w:type="gramStart"/>
       <w:r>
         <w:rPr>
           <w:b/>
@@ -1753,18 +1443,7 @@
           <w:sz w:val="24"/>
           <w:szCs w:val="24"/>
         </w:rPr>
-        <w:t>3.1  Data</w:t>
-      </w:r>
-      <w:proofErr w:type="gramEnd"/>
-      <w:r>
-        <w:rPr>
-          <w:b/>
-          <w:bCs/>
-          <w:color w:val="003087"/>
-          <w:sz w:val="24"/>
-          <w:szCs w:val="24"/>
-        </w:rPr>
-        <w:t xml:space="preserve"> Sources</w:t>
+        <w:t>3.1  Data Sources</w:t>
       </w:r>
     </w:p>
     <w:tbl>
@@ -2255,7 +1934,6 @@
         </w:pBdr>
         <w:spacing w:before="280" w:after="120"/>
       </w:pPr>
-      <w:proofErr w:type="gramStart"/>
       <w:r>
         <w:rPr>
           <w:b/>
@@ -2266,7 +1944,6 @@
         </w:rPr>
         <w:t>3.2  Tools</w:t>
       </w:r>
-      <w:proofErr w:type="gramEnd"/>
     </w:p>
     <w:p>
       <w:pPr>
@@ -2278,7 +1955,19 @@
         <w:spacing w:before="60" w:after="60"/>
       </w:pPr>
       <w:r>
-        <w:t>SQL (SQLite via DB Browser for SQLite) — data import, cleaning, and all analytical queries</w:t>
+        <w:t>SQL (SQLite via DB Browser</w:t>
+      </w:r>
+      <w:r>
+        <w:t>)</w:t>
+      </w:r>
+      <w:r>
+        <w:t xml:space="preserve"> </w:t>
+      </w:r>
+      <w:r>
+        <w:t>for</w:t>
+      </w:r>
+      <w:r>
+        <w:t xml:space="preserve"> data import, cleaning, and all analytical queries</w:t>
       </w:r>
     </w:p>
     <w:p>
@@ -2291,7 +1980,13 @@
         <w:spacing w:before="60" w:after="60"/>
       </w:pPr>
       <w:r>
-        <w:t>Microsoft Excel — export processing, pivot tables, and dashboard charts</w:t>
+        <w:t xml:space="preserve">Microsoft Excel </w:t>
+      </w:r>
+      <w:r>
+        <w:t xml:space="preserve">for </w:t>
+      </w:r>
+      <w:r>
+        <w:t>export processing, pivot tables, and dashboard charts</w:t>
       </w:r>
     </w:p>
     <w:p>
@@ -2306,7 +2001,6 @@
         </w:pBdr>
         <w:spacing w:before="280" w:after="120"/>
       </w:pPr>
-      <w:proofErr w:type="gramStart"/>
       <w:r>
         <w:rPr>
           <w:b/>
@@ -2315,18 +2009,7 @@
           <w:sz w:val="24"/>
           <w:szCs w:val="24"/>
         </w:rPr>
-        <w:t>3.3  Data</w:t>
-      </w:r>
-      <w:proofErr w:type="gramEnd"/>
-      <w:r>
-        <w:rPr>
-          <w:b/>
-          <w:bCs/>
-          <w:color w:val="003087"/>
-          <w:sz w:val="24"/>
-          <w:szCs w:val="24"/>
-        </w:rPr>
-        <w:t xml:space="preserve"> Cleaning Decisions</w:t>
+        <w:t>3.3  Data Cleaning Decisions</w:t>
       </w:r>
     </w:p>
     <w:p>
@@ -2334,23 +2017,7 @@
         <w:spacing w:before="80" w:after="100"/>
       </w:pPr>
       <w:r>
-        <w:t xml:space="preserve">All raw data </w:t>
-      </w:r>
-      <w:proofErr w:type="gramStart"/>
-      <w:r>
-        <w:t>was imported</w:t>
-      </w:r>
-      <w:proofErr w:type="gramEnd"/>
-      <w:r>
-        <w:t xml:space="preserve"> into separate staging tables before cleaning. A structured cleaning process </w:t>
-      </w:r>
-      <w:proofErr w:type="gramStart"/>
-      <w:r>
-        <w:t>was applied</w:t>
-      </w:r>
-      <w:proofErr w:type="gramEnd"/>
-      <w:r>
-        <w:t>, with every decision documented for auditability.</w:t>
+        <w:t>All raw data was imported into separate staging tables before cleaning. A structured cleaning process was applied, with every decision documented for auditability.</w:t>
       </w:r>
     </w:p>
     <w:p>
@@ -2852,23 +2519,7 @@
                 <w:sz w:val="20"/>
                 <w:szCs w:val="20"/>
               </w:rPr>
-              <w:t xml:space="preserve">Unknown outcome rows </w:t>
-            </w:r>
-            <w:proofErr w:type="gramStart"/>
-            <w:r>
-              <w:rPr>
-                <w:sz w:val="20"/>
-                <w:szCs w:val="20"/>
-              </w:rPr>
-              <w:t>are retained</w:t>
-            </w:r>
-            <w:proofErr w:type="gramEnd"/>
-            <w:r>
-              <w:rPr>
-                <w:sz w:val="20"/>
-                <w:szCs w:val="20"/>
-              </w:rPr>
-              <w:t xml:space="preserve"> but excluded from DNA rate calculations to avoid understating rates.</w:t>
+              <w:t>Unknown outcome rows are retained but excluded from DNA rate calculations to avoid understating rates.</w:t>
             </w:r>
           </w:p>
         </w:tc>
@@ -2949,15 +2600,7 @@
                 <w:sz w:val="20"/>
                 <w:szCs w:val="20"/>
               </w:rPr>
-              <w:t xml:space="preserve">Out-of-range decile values indicate data entry error. Set to NULL to </w:t>
-            </w:r>
-            <w:r>
-              <w:rPr>
-                <w:sz w:val="20"/>
-                <w:szCs w:val="20"/>
-              </w:rPr>
-              <w:lastRenderedPageBreak/>
-              <w:t>preserve the row for score-based joins.</w:t>
+              <w:t>Out-of-range decile values indicate data entry error. Set to NULL to preserve the row for score-based joins.</w:t>
             </w:r>
           </w:p>
         </w:tc>
@@ -2983,7 +2626,6 @@
                 <w:sz w:val="20"/>
                 <w:szCs w:val="20"/>
               </w:rPr>
-              <w:lastRenderedPageBreak/>
               <w:t>Minimal</w:t>
             </w:r>
           </w:p>
@@ -3002,7 +2644,6 @@
         </w:pBdr>
         <w:spacing w:before="280" w:after="120"/>
       </w:pPr>
-      <w:proofErr w:type="gramStart"/>
       <w:r>
         <w:rPr>
           <w:b/>
@@ -3011,18 +2652,7 @@
           <w:sz w:val="24"/>
           <w:szCs w:val="24"/>
         </w:rPr>
-        <w:t>3.4  Analytical</w:t>
-      </w:r>
-      <w:proofErr w:type="gramEnd"/>
-      <w:r>
-        <w:rPr>
-          <w:b/>
-          <w:bCs/>
-          <w:color w:val="003087"/>
-          <w:sz w:val="24"/>
-          <w:szCs w:val="24"/>
-        </w:rPr>
-        <w:t xml:space="preserve"> Approach</w:t>
+        <w:t>3.4  Analytical Approach</w:t>
       </w:r>
     </w:p>
     <w:p>
@@ -3030,23 +2660,7 @@
         <w:spacing w:before="80" w:after="100"/>
       </w:pPr>
       <w:r>
-        <w:t xml:space="preserve">SQL aggregate queries </w:t>
-      </w:r>
-      <w:proofErr w:type="gramStart"/>
-      <w:r>
-        <w:t>were used</w:t>
-      </w:r>
-      <w:proofErr w:type="gramEnd"/>
-      <w:r>
-        <w:t xml:space="preserve"> to calculate DNA rates as the proportion of appointments with status 'Did Not Attend' against total attended-or-DNA appointments, expressed as a percentage. Results </w:t>
-      </w:r>
-      <w:proofErr w:type="gramStart"/>
-      <w:r>
-        <w:t>were exported</w:t>
-      </w:r>
-      <w:proofErr w:type="gramEnd"/>
-      <w:r>
-        <w:t xml:space="preserve"> as CSV and visualised in Excel using line charts, bar charts, stacked area charts, and clustered bar charts. The deprivation analysis joins Sub-ICB level DNA rates to Local Authority level IMD scores via a text-matching approximation, documented as a limitation in Section 5.</w:t>
+        <w:t>SQL aggregate queries were used to calculate DNA rates as the proportion of appointments with status 'Did Not Attend' against total attended-or-DNA appointments, expressed as a percentage. Results were exported as CSV and visualised in Excel using line charts, bar charts, stacked area charts, and clustered bar charts. The deprivation analysis joins Sub-ICB level DNA rates to Local Authority level IMD scores via a text-matching approximation, documented as a limitation in Section 5.</w:t>
       </w:r>
     </w:p>
     <w:p>
@@ -3054,15 +2668,7 @@
         <w:spacing w:before="80" w:after="100"/>
       </w:pPr>
       <w:r>
-        <w:t xml:space="preserve">DNA Rate formula applied throughout: DNA Rate (%) = (DNA Count / (DNA Count + Attended Count)) × 100. Booked and Unknown statuses </w:t>
-      </w:r>
-      <w:proofErr w:type="gramStart"/>
-      <w:r>
-        <w:t>are excluded</w:t>
-      </w:r>
-      <w:proofErr w:type="gramEnd"/>
-      <w:r>
-        <w:t xml:space="preserve"> from both the numerator and denominator.</w:t>
+        <w:t>DNA Rate formula applied throughout: DNA Rate (%) = (DNA Count / (DNA Count + Attended Count)) × 100. Booked and Unknown statuses are excluded from both the numerator and denominator.</w:t>
       </w:r>
     </w:p>
     <w:p>
@@ -3096,7 +2702,6 @@
         </w:pBdr>
         <w:spacing w:before="280" w:after="120"/>
       </w:pPr>
-      <w:proofErr w:type="gramStart"/>
       <w:r>
         <w:rPr>
           <w:b/>
@@ -3105,18 +2710,7 @@
           <w:sz w:val="24"/>
           <w:szCs w:val="24"/>
         </w:rPr>
-        <w:t>4.1  Q</w:t>
-      </w:r>
-      <w:proofErr w:type="gramEnd"/>
-      <w:r>
-        <w:rPr>
-          <w:b/>
-          <w:bCs/>
-          <w:color w:val="003087"/>
-          <w:sz w:val="24"/>
-          <w:szCs w:val="24"/>
-        </w:rPr>
-        <w:t>1 — Regional DNA Rates and Structural Concentration</w:t>
+        <w:t>4.1  Q1 — Regional DNA Rates and Structural Concentration</w:t>
       </w:r>
     </w:p>
     <w:p>
@@ -3124,15 +2718,7 @@
         <w:spacing w:before="80" w:after="100"/>
       </w:pPr>
       <w:r>
-        <w:t>Analysis of the PCN granular dataset reveals significant variation in DNA rates across all seven NHS regions and 96 Sub-ICB locations in England. The national average of approximately 4.8% is stable across the 30-month period, but this masks a 2.7× gap between the highest (London, 12.15%) and lowest (</w:t>
-      </w:r>
-      <w:proofErr w:type="gramStart"/>
-      <w:r>
-        <w:t>South West</w:t>
-      </w:r>
-      <w:proofErr w:type="gramEnd"/>
-      <w:r>
-        <w:t>, 4.51%) regions.</w:t>
+        <w:t>Analysis of the PCN granular dataset reveals significant variation in DNA rates across all seven NHS regions and 96 Sub-ICB locations in England. The national average of approximately 4.8% is stable across the 30-month period, but this masks a 2.7× gap between the highest (London, 12.15%) and lowest (South West, 4.51%) regions.</w:t>
       </w:r>
     </w:p>
     <w:p>
@@ -3278,29 +2864,7 @@
           <w:sz w:val="18"/>
           <w:szCs w:val="18"/>
         </w:rPr>
-        <w:t xml:space="preserve">Figure 2 — DNA rate by NHS region. London and the </w:t>
-      </w:r>
-      <w:proofErr w:type="gramStart"/>
-      <w:r>
-        <w:rPr>
-          <w:i/>
-          <w:iCs/>
-          <w:color w:val="637381"/>
-          <w:sz w:val="18"/>
-          <w:szCs w:val="18"/>
-        </w:rPr>
-        <w:t>North West</w:t>
-      </w:r>
-      <w:proofErr w:type="gramEnd"/>
-      <w:r>
-        <w:rPr>
-          <w:i/>
-          <w:iCs/>
-          <w:color w:val="637381"/>
-          <w:sz w:val="18"/>
-          <w:szCs w:val="18"/>
-        </w:rPr>
-        <w:t xml:space="preserve"> are in a different tier from the other five regions, both exceeding 11%.</w:t>
+        <w:t>Figure 2 — DNA rate by NHS region. London and the North West are in a different tier from the other five regions, both exceeding 11%.</w:t>
       </w:r>
     </w:p>
     <w:p>
@@ -3313,15 +2877,7 @@
         <w:spacing w:before="60" w:after="60"/>
       </w:pPr>
       <w:r>
-        <w:t xml:space="preserve">London: 12.15% — 513,023 DNAs from 4,223,020 appointments. The highest rate by a wide margin and 2.7× above </w:t>
-      </w:r>
-      <w:proofErr w:type="gramStart"/>
-      <w:r>
-        <w:t>South West</w:t>
-      </w:r>
-      <w:proofErr w:type="gramEnd"/>
-      <w:r>
-        <w:t>.</w:t>
+        <w:t>London: 12.15% — 513,023 DNAs from 4,223,020 appointments. The highest rate by a wide margin and 2.7× above South West.</w:t>
       </w:r>
     </w:p>
     <w:p>
@@ -3333,13 +2889,8 @@
         </w:numPr>
         <w:spacing w:before="60" w:after="60"/>
       </w:pPr>
-      <w:proofErr w:type="gramStart"/>
-      <w:r>
-        <w:t>North West</w:t>
-      </w:r>
-      <w:proofErr w:type="gramEnd"/>
-      <w:r>
-        <w:t>: 11.84% — 182,335 DNAs from 1,540,415 appointments. Close behind London and host to five of the top ten worst Sub-ICBs nationally.</w:t>
+      <w:r>
+        <w:t>North West: 11.84% — 182,335 DNAs from 1,540,415 appointments. Close behind London and host to five of the top ten worst Sub-ICBs nationally.</w:t>
       </w:r>
     </w:p>
     <w:p>
@@ -3352,15 +2903,7 @@
         <w:spacing w:before="60" w:after="60"/>
       </w:pPr>
       <w:r>
-        <w:t xml:space="preserve">Midlands: 8.71% — </w:t>
-      </w:r>
-      <w:proofErr w:type="gramStart"/>
-      <w:r>
-        <w:t>substantially above</w:t>
-      </w:r>
-      <w:proofErr w:type="gramEnd"/>
-      <w:r>
-        <w:t xml:space="preserve"> the national average, with significant internal variation.</w:t>
+        <w:t>Midlands: 8.71% — substantially above the national average, with significant internal variation.</w:t>
       </w:r>
     </w:p>
     <w:p>
@@ -3372,14 +2915,9 @@
         </w:numPr>
         <w:spacing w:before="60" w:after="60"/>
       </w:pPr>
-      <w:proofErr w:type="gramStart"/>
       <w:r>
         <w:lastRenderedPageBreak/>
-        <w:t>South West</w:t>
-      </w:r>
-      <w:proofErr w:type="gramEnd"/>
-      <w:r>
-        <w:t>: 4.51% — the best performing region, notable given it contains the nationally outlying Sub-ICB in Bristol (21.84%).</w:t>
+        <w:t>South West: 4.51% — the best performing region, notable given it contains the nationally outlying Sub-ICB in Bristol (21.84%).</w:t>
       </w:r>
     </w:p>
     <w:p>
@@ -3698,37 +3236,8 @@
                 <w:sz w:val="20"/>
                 <w:szCs w:val="20"/>
               </w:rPr>
-              <w:t xml:space="preserve">NHS Bristol, </w:t>
-            </w:r>
-            <w:proofErr w:type="spellStart"/>
-            <w:proofErr w:type="gramStart"/>
-            <w:r>
-              <w:rPr>
-                <w:sz w:val="20"/>
-                <w:szCs w:val="20"/>
-              </w:rPr>
-              <w:t>N.Somerset</w:t>
-            </w:r>
-            <w:proofErr w:type="spellEnd"/>
-            <w:proofErr w:type="gramEnd"/>
-            <w:r>
-              <w:rPr>
-                <w:sz w:val="20"/>
-                <w:szCs w:val="20"/>
-              </w:rPr>
-              <w:t xml:space="preserve"> &amp; </w:t>
-            </w:r>
-            <w:proofErr w:type="spellStart"/>
-            <w:proofErr w:type="gramStart"/>
-            <w:r>
-              <w:rPr>
-                <w:sz w:val="20"/>
-                <w:szCs w:val="20"/>
-              </w:rPr>
-              <w:t>S.Gloucestershire</w:t>
-            </w:r>
-            <w:proofErr w:type="spellEnd"/>
-            <w:proofErr w:type="gramEnd"/>
+              <w:t>NHS Bristol, N.Somerset &amp; S.Gloucestershire</w:t>
+            </w:r>
           </w:p>
         </w:tc>
         <w:tc>
@@ -3748,7 +3257,6 @@
             </w:tcMar>
           </w:tcPr>
           <w:p>
-            <w:proofErr w:type="gramStart"/>
             <w:r>
               <w:rPr>
                 <w:sz w:val="20"/>
@@ -3756,7 +3264,6 @@
               </w:rPr>
               <w:t>South West</w:t>
             </w:r>
-            <w:proofErr w:type="gramEnd"/>
           </w:p>
         </w:tc>
         <w:tc>
@@ -3972,7 +3479,6 @@
             </w:tcMar>
           </w:tcPr>
           <w:p>
-            <w:proofErr w:type="gramStart"/>
             <w:r>
               <w:rPr>
                 <w:sz w:val="20"/>
@@ -3980,7 +3486,6 @@
               </w:rPr>
               <w:t>South East</w:t>
             </w:r>
-            <w:proofErr w:type="gramEnd"/>
           </w:p>
         </w:tc>
         <w:tc>
@@ -4085,7 +3590,6 @@
             </w:tcMar>
           </w:tcPr>
           <w:p>
-            <w:proofErr w:type="gramStart"/>
             <w:r>
               <w:rPr>
                 <w:sz w:val="20"/>
@@ -4093,7 +3597,6 @@
               </w:rPr>
               <w:t>North West</w:t>
             </w:r>
-            <w:proofErr w:type="gramEnd"/>
           </w:p>
         </w:tc>
         <w:tc>
@@ -4198,7 +3701,6 @@
             </w:tcMar>
           </w:tcPr>
           <w:p>
-            <w:proofErr w:type="gramStart"/>
             <w:r>
               <w:rPr>
                 <w:sz w:val="20"/>
@@ -4206,7 +3708,6 @@
               </w:rPr>
               <w:t>North West</w:t>
             </w:r>
-            <w:proofErr w:type="gramEnd"/>
           </w:p>
         </w:tc>
         <w:tc>
@@ -4311,7 +3812,6 @@
             </w:tcMar>
           </w:tcPr>
           <w:p>
-            <w:proofErr w:type="gramStart"/>
             <w:r>
               <w:rPr>
                 <w:sz w:val="20"/>
@@ -4319,7 +3819,6 @@
               </w:rPr>
               <w:t>North West</w:t>
             </w:r>
-            <w:proofErr w:type="gramEnd"/>
           </w:p>
         </w:tc>
         <w:tc>
@@ -4535,7 +4034,6 @@
             </w:tcMar>
           </w:tcPr>
           <w:p>
-            <w:proofErr w:type="gramStart"/>
             <w:r>
               <w:rPr>
                 <w:sz w:val="20"/>
@@ -4543,7 +4041,6 @@
               </w:rPr>
               <w:t>North West</w:t>
             </w:r>
-            <w:proofErr w:type="gramEnd"/>
           </w:p>
         </w:tc>
         <w:tc>
@@ -4727,51 +4224,7 @@
           <w:sz w:val="18"/>
           <w:szCs w:val="18"/>
         </w:rPr>
-        <w:t xml:space="preserve">Table 1 — Top 10 highest DNA rate Sub-ICBs. Note that 05Q (32.84%) is a significant outlier driven by </w:t>
-      </w:r>
-      <w:proofErr w:type="gramStart"/>
-      <w:r>
-        <w:rPr>
-          <w:i/>
-          <w:iCs/>
-          <w:color w:val="637381"/>
-          <w:sz w:val="18"/>
-          <w:szCs w:val="18"/>
-        </w:rPr>
-        <w:t>very low</w:t>
-      </w:r>
-      <w:proofErr w:type="gramEnd"/>
-      <w:r>
-        <w:rPr>
-          <w:i/>
-          <w:iCs/>
-          <w:color w:val="637381"/>
-          <w:sz w:val="18"/>
-          <w:szCs w:val="18"/>
-        </w:rPr>
-        <w:t xml:space="preserve"> appointment volumes (2,966); its rate warrants investigation but should </w:t>
-      </w:r>
-      <w:proofErr w:type="gramStart"/>
-      <w:r>
-        <w:rPr>
-          <w:i/>
-          <w:iCs/>
-          <w:color w:val="637381"/>
-          <w:sz w:val="18"/>
-          <w:szCs w:val="18"/>
-        </w:rPr>
-        <w:t>be interpreted</w:t>
-      </w:r>
-      <w:proofErr w:type="gramEnd"/>
-      <w:r>
-        <w:rPr>
-          <w:i/>
-          <w:iCs/>
-          <w:color w:val="637381"/>
-          <w:sz w:val="18"/>
-          <w:szCs w:val="18"/>
-        </w:rPr>
-        <w:t xml:space="preserve"> cautiously.</w:t>
+        <w:t>Table 1 — Top 10 highest DNA rate Sub-ICBs. Note that 05Q (32.84%) is a significant outlier driven by very low appointment volumes (2,966); its rate warrants investigation but should be interpreted cautiously.</w:t>
       </w:r>
     </w:p>
     <w:p>
@@ -5064,23 +4517,7 @@
                 <w:sz w:val="20"/>
                 <w:szCs w:val="20"/>
               </w:rPr>
-              <w:t xml:space="preserve">NHS Suffolk &amp; </w:t>
-            </w:r>
-            <w:proofErr w:type="gramStart"/>
-            <w:r>
-              <w:rPr>
-                <w:sz w:val="20"/>
-                <w:szCs w:val="20"/>
-              </w:rPr>
-              <w:t>North East</w:t>
-            </w:r>
-            <w:proofErr w:type="gramEnd"/>
-            <w:r>
-              <w:rPr>
-                <w:sz w:val="20"/>
-                <w:szCs w:val="20"/>
-              </w:rPr>
-              <w:t xml:space="preserve"> Essex — 07K</w:t>
+              <w:t>NHS Suffolk &amp; North East Essex — 07K</w:t>
             </w:r>
           </w:p>
         </w:tc>
@@ -5190,23 +4627,7 @@
                 <w:sz w:val="20"/>
                 <w:szCs w:val="20"/>
               </w:rPr>
-              <w:t xml:space="preserve">NHS Suffolk &amp; </w:t>
-            </w:r>
-            <w:proofErr w:type="gramStart"/>
-            <w:r>
-              <w:rPr>
-                <w:sz w:val="20"/>
-                <w:szCs w:val="20"/>
-              </w:rPr>
-              <w:t>North East</w:t>
-            </w:r>
-            <w:proofErr w:type="gramEnd"/>
-            <w:r>
-              <w:rPr>
-                <w:sz w:val="20"/>
-                <w:szCs w:val="20"/>
-              </w:rPr>
-              <w:t xml:space="preserve"> Essex — 06L</w:t>
+              <w:t>NHS Suffolk &amp; North East Essex — 06L</w:t>
             </w:r>
           </w:p>
         </w:tc>
@@ -5672,7 +5093,6 @@
             </w:tcMar>
           </w:tcPr>
           <w:p>
-            <w:proofErr w:type="gramStart"/>
             <w:r>
               <w:rPr>
                 <w:sz w:val="20"/>
@@ -5680,7 +5100,6 @@
               </w:rPr>
               <w:t>South West</w:t>
             </w:r>
-            <w:proofErr w:type="gramEnd"/>
           </w:p>
         </w:tc>
         <w:tc>
@@ -5785,7 +5204,6 @@
             </w:tcMar>
           </w:tcPr>
           <w:p>
-            <w:proofErr w:type="gramStart"/>
             <w:r>
               <w:rPr>
                 <w:sz w:val="20"/>
@@ -5793,7 +5211,6 @@
               </w:rPr>
               <w:t>South East</w:t>
             </w:r>
-            <w:proofErr w:type="gramEnd"/>
           </w:p>
         </w:tc>
         <w:tc>
@@ -5899,7 +5316,6 @@
             </w:tcMar>
           </w:tcPr>
           <w:p>
-            <w:proofErr w:type="gramStart"/>
             <w:r>
               <w:rPr>
                 <w:sz w:val="20"/>
@@ -5907,7 +5323,6 @@
               </w:rPr>
               <w:t>South West</w:t>
             </w:r>
-            <w:proofErr w:type="gramEnd"/>
           </w:p>
         </w:tc>
         <w:tc>
@@ -6160,51 +5575,7 @@
           <w:sz w:val="18"/>
           <w:szCs w:val="18"/>
         </w:rPr>
-        <w:t xml:space="preserve">Figure 3 — Distribution of DNA rates across 96 Sub-ICBs. </w:t>
-      </w:r>
-      <w:proofErr w:type="gramStart"/>
-      <w:r>
-        <w:rPr>
-          <w:i/>
-          <w:iCs/>
-          <w:color w:val="637381"/>
-          <w:sz w:val="18"/>
-          <w:szCs w:val="18"/>
-        </w:rPr>
-        <w:t>Roughly one</w:t>
-      </w:r>
-      <w:proofErr w:type="gramEnd"/>
-      <w:r>
-        <w:rPr>
-          <w:i/>
-          <w:iCs/>
-          <w:color w:val="637381"/>
-          <w:sz w:val="18"/>
-          <w:szCs w:val="18"/>
-        </w:rPr>
-        <w:t xml:space="preserve"> third are below 6%, one third between 6–10%, and one third above 10%. The distribution is right-skewed, pulled upward by a tail of high-rate Sub-ICBs concentrated in London and the </w:t>
-      </w:r>
-      <w:proofErr w:type="gramStart"/>
-      <w:r>
-        <w:rPr>
-          <w:i/>
-          <w:iCs/>
-          <w:color w:val="637381"/>
-          <w:sz w:val="18"/>
-          <w:szCs w:val="18"/>
-        </w:rPr>
-        <w:t>North West</w:t>
-      </w:r>
-      <w:proofErr w:type="gramEnd"/>
-      <w:r>
-        <w:rPr>
-          <w:i/>
-          <w:iCs/>
-          <w:color w:val="637381"/>
-          <w:sz w:val="18"/>
-          <w:szCs w:val="18"/>
-        </w:rPr>
-        <w:t>.</w:t>
+        <w:t>Figure 3 — Distribution of DNA rates across 96 Sub-ICBs. Roughly one third are below 6%, one third between 6–10%, and one third above 10%. The distribution is right-skewed, pulled upward by a tail of high-rate Sub-ICBs concentrated in London and the North West.</w:t>
       </w:r>
     </w:p>
     <w:p>
@@ -6219,7 +5590,6 @@
         </w:pBdr>
         <w:spacing w:before="280" w:after="120"/>
       </w:pPr>
-      <w:proofErr w:type="gramStart"/>
       <w:r>
         <w:rPr>
           <w:b/>
@@ -6229,18 +5599,7 @@
           <w:szCs w:val="24"/>
         </w:rPr>
         <w:lastRenderedPageBreak/>
-        <w:t>4.2  Q</w:t>
-      </w:r>
-      <w:proofErr w:type="gramEnd"/>
-      <w:r>
-        <w:rPr>
-          <w:b/>
-          <w:bCs/>
-          <w:color w:val="003087"/>
-          <w:sz w:val="24"/>
-          <w:szCs w:val="24"/>
-        </w:rPr>
-        <w:t>2 — Appointment Friction and DNA Rates</w:t>
+        <w:t>4.2  Q2 — Appointment Friction and DNA Rates</w:t>
       </w:r>
     </w:p>
     <w:p>
@@ -6346,15 +5705,7 @@
         <w:spacing w:before="80" w:after="100"/>
       </w:pPr>
       <w:r>
-        <w:t xml:space="preserve">The most coherent explanation is not that face-to-face appointments are harder to get to (the 'travel cost' hypothesis), but that they are harder to silently abandon. A face-to-face booking carries an implicit social contract — missing it requires a conscious choice to leave a slot empty, whereas a telephone or video appointment can </w:t>
-      </w:r>
-      <w:proofErr w:type="gramStart"/>
-      <w:r>
-        <w:t>be quietly ignored</w:t>
-      </w:r>
-      <w:proofErr w:type="gramEnd"/>
-      <w:r>
-        <w:t xml:space="preserve"> without the same psychological barrier.</w:t>
+        <w:t>The most coherent explanation is not that face-to-face appointments are harder to get to (the 'travel cost' hypothesis), but that they are harder to silently abandon. A face-to-face booking carries an implicit social contract — missing it requires a conscious choice to leave a slot empty, whereas a telephone or video appointment can be quietly ignored without the same psychological barrier.</w:t>
       </w:r>
     </w:p>
     <w:p>
@@ -6362,15 +5713,7 @@
         <w:spacing w:before="80" w:after="100"/>
       </w:pPr>
       <w:r>
-        <w:t xml:space="preserve">This mirrors a well-documented behavioural pattern in service industries: people are more likely to abandon an online shopping cart than walk out of a physical shop mid-purchase. The 'friction' </w:t>
-      </w:r>
-      <w:proofErr w:type="gramStart"/>
-      <w:r>
-        <w:t>that matters</w:t>
-      </w:r>
-      <w:proofErr w:type="gramEnd"/>
-      <w:r>
-        <w:t xml:space="preserve"> is at the exit, not the entrance.</w:t>
+        <w:t>This mirrors a well-documented behavioural pattern in service industries: people are more likely to abandon an online shopping cart than walk out of a physical shop mid-purchase. The 'friction' that matters is at the exit, not the entrance.</w:t>
       </w:r>
     </w:p>
     <w:p>
@@ -6378,23 +5721,7 @@
         <w:spacing w:before="80" w:after="100"/>
       </w:pPr>
       <w:r>
-        <w:t xml:space="preserve">The travel cost hypothesis — that patients in less affluent areas cannot afford bus fares or fuel — </w:t>
-      </w:r>
-      <w:proofErr w:type="gramStart"/>
-      <w:r>
-        <w:t>is also challenged</w:t>
-      </w:r>
-      <w:proofErr w:type="gramEnd"/>
-      <w:r>
-        <w:t xml:space="preserve"> by the deprivation data (Section 4.3), which shows that the least deprived areas have higher DNA rates. If transport cost were the primary driver, the pattern would </w:t>
-      </w:r>
-      <w:proofErr w:type="gramStart"/>
-      <w:r>
-        <w:t>be inverted</w:t>
-      </w:r>
-      <w:proofErr w:type="gramEnd"/>
-      <w:r>
-        <w:t>.</w:t>
+        <w:t>The travel cost hypothesis — that patients in less affluent areas cannot afford bus fares or fuel — is also challenged by the deprivation data (Section 4.3), which shows that the least deprived areas have higher DNA rates. If transport cost were the primary driver, the pattern would be inverted.</w:t>
       </w:r>
     </w:p>
     <w:p>
@@ -6464,29 +5791,7 @@
           <w:sz w:val="18"/>
           <w:szCs w:val="18"/>
         </w:rPr>
-        <w:t xml:space="preserve">Figure 5 — Face-to-face vs telephone DNA rate by region. F2F consistently exceeds telephone in every region. Note the North West's telephone DNA rate (8.60%) — higher than the face-to-face rate in </w:t>
-      </w:r>
-      <w:proofErr w:type="gramStart"/>
-      <w:r>
-        <w:rPr>
-          <w:i/>
-          <w:iCs/>
-          <w:color w:val="637381"/>
-          <w:sz w:val="18"/>
-          <w:szCs w:val="18"/>
-        </w:rPr>
-        <w:t>South West</w:t>
-      </w:r>
-      <w:proofErr w:type="gramEnd"/>
-      <w:r>
-        <w:rPr>
-          <w:i/>
-          <w:iCs/>
-          <w:color w:val="637381"/>
-          <w:sz w:val="18"/>
-          <w:szCs w:val="18"/>
-        </w:rPr>
-        <w:t xml:space="preserve"> (5.76%) — which shows that regional factors compound the mode effect.</w:t>
+        <w:t>Figure 5 — Face-to-face vs telephone DNA rate by region. F2F consistently exceeds telephone in every region. Note the North West's telephone DNA rate (8.60%) — higher than the face-to-face rate in South West (5.76%) — which shows that regional factors compound the mode effect.</w:t>
       </w:r>
     </w:p>
     <w:p>
@@ -6692,7 +5997,6 @@
         </w:pBdr>
         <w:spacing w:before="280" w:after="120"/>
       </w:pPr>
-      <w:proofErr w:type="gramStart"/>
       <w:r>
         <w:rPr>
           <w:b/>
@@ -6702,18 +6006,7 @@
           <w:szCs w:val="24"/>
         </w:rPr>
         <w:lastRenderedPageBreak/>
-        <w:t>4.3  Q</w:t>
-      </w:r>
-      <w:proofErr w:type="gramEnd"/>
-      <w:r>
-        <w:rPr>
-          <w:b/>
-          <w:bCs/>
-          <w:color w:val="003087"/>
-          <w:sz w:val="24"/>
-          <w:szCs w:val="24"/>
-        </w:rPr>
-        <w:t>3 — Deprivation as a Predictor of DNA Rates</w:t>
+        <w:t>4.3  Q3 — Deprivation as a Predictor of DNA Rates</w:t>
       </w:r>
     </w:p>
     <w:p>
@@ -6899,7 +6192,6 @@
             <w:vAlign w:val="center"/>
           </w:tcPr>
           <w:p>
-            <w:proofErr w:type="spellStart"/>
             <w:r>
               <w:rPr>
                 <w:b/>
@@ -6908,9 +6200,29 @@
                 <w:sz w:val="19"/>
                 <w:szCs w:val="19"/>
               </w:rPr>
-              <w:t>Avg</w:t>
-            </w:r>
-            <w:proofErr w:type="spellEnd"/>
+              <w:t>Avg DNA %</w:t>
+            </w:r>
+          </w:p>
+        </w:tc>
+        <w:tc>
+          <w:tcPr>
+            <w:tcW w:w="1600" w:type="dxa"/>
+            <w:tcBorders>
+              <w:top w:val="single" w:sz="1" w:space="0" w:color="FFFFFF"/>
+              <w:left w:val="single" w:sz="1" w:space="0" w:color="FFFFFF"/>
+              <w:bottom w:val="single" w:sz="1" w:space="0" w:color="FFFFFF"/>
+              <w:right w:val="single" w:sz="1" w:space="0" w:color="FFFFFF"/>
+            </w:tcBorders>
+            <w:shd w:val="clear" w:color="auto" w:fill="003087"/>
+            <w:tcMar>
+              <w:top w:w="100" w:type="dxa"/>
+              <w:left w:w="140" w:type="dxa"/>
+              <w:bottom w:w="100" w:type="dxa"/>
+              <w:right w:w="140" w:type="dxa"/>
+            </w:tcMar>
+            <w:vAlign w:val="center"/>
+          </w:tcPr>
+          <w:p>
             <w:r>
               <w:rPr>
                 <w:b/>
@@ -6919,13 +6231,13 @@
                 <w:sz w:val="19"/>
                 <w:szCs w:val="19"/>
               </w:rPr>
-              <w:t xml:space="preserve"> DNA %</w:t>
-            </w:r>
-          </w:p>
-        </w:tc>
-        <w:tc>
-          <w:tcPr>
-            <w:tcW w:w="1600" w:type="dxa"/>
+              <w:t>Min DNA %</w:t>
+            </w:r>
+          </w:p>
+        </w:tc>
+        <w:tc>
+          <w:tcPr>
+            <w:tcW w:w="2026" w:type="dxa"/>
             <w:tcBorders>
               <w:top w:val="single" w:sz="1" w:space="0" w:color="FFFFFF"/>
               <w:left w:val="single" w:sz="1" w:space="0" w:color="FFFFFF"/>
@@ -6950,37 +6262,6 @@
                 <w:sz w:val="19"/>
                 <w:szCs w:val="19"/>
               </w:rPr>
-              <w:t>Min DNA %</w:t>
-            </w:r>
-          </w:p>
-        </w:tc>
-        <w:tc>
-          <w:tcPr>
-            <w:tcW w:w="2026" w:type="dxa"/>
-            <w:tcBorders>
-              <w:top w:val="single" w:sz="1" w:space="0" w:color="FFFFFF"/>
-              <w:left w:val="single" w:sz="1" w:space="0" w:color="FFFFFF"/>
-              <w:bottom w:val="single" w:sz="1" w:space="0" w:color="FFFFFF"/>
-              <w:right w:val="single" w:sz="1" w:space="0" w:color="FFFFFF"/>
-            </w:tcBorders>
-            <w:shd w:val="clear" w:color="auto" w:fill="003087"/>
-            <w:tcMar>
-              <w:top w:w="100" w:type="dxa"/>
-              <w:left w:w="140" w:type="dxa"/>
-              <w:bottom w:w="100" w:type="dxa"/>
-              <w:right w:w="140" w:type="dxa"/>
-            </w:tcMar>
-            <w:vAlign w:val="center"/>
-          </w:tcPr>
-          <w:p>
-            <w:r>
-              <w:rPr>
-                <w:b/>
-                <w:bCs/>
-                <w:color w:val="FFFFFF"/>
-                <w:sz w:val="19"/>
-                <w:szCs w:val="19"/>
-              </w:rPr>
               <w:t>Max DNA %</w:t>
             </w:r>
           </w:p>
@@ -7010,23 +6291,7 @@
                 <w:sz w:val="20"/>
                 <w:szCs w:val="20"/>
               </w:rPr>
-              <w:t>Bands 5–</w:t>
-            </w:r>
-            <w:proofErr w:type="gramStart"/>
-            <w:r>
-              <w:rPr>
-                <w:sz w:val="20"/>
-                <w:szCs w:val="20"/>
-              </w:rPr>
-              <w:t>6  (</w:t>
-            </w:r>
-            <w:proofErr w:type="gramEnd"/>
-            <w:r>
-              <w:rPr>
-                <w:sz w:val="20"/>
-                <w:szCs w:val="20"/>
-              </w:rPr>
-              <w:t>More Deprived)</w:t>
+              <w:t>Bands 5–6  (More Deprived)</w:t>
             </w:r>
           </w:p>
         </w:tc>
@@ -7165,23 +6430,7 @@
                 <w:sz w:val="20"/>
                 <w:szCs w:val="20"/>
               </w:rPr>
-              <w:t>Bands 7–</w:t>
-            </w:r>
-            <w:proofErr w:type="gramStart"/>
-            <w:r>
-              <w:rPr>
-                <w:sz w:val="20"/>
-                <w:szCs w:val="20"/>
-              </w:rPr>
-              <w:t>8  (</w:t>
-            </w:r>
-            <w:proofErr w:type="gramEnd"/>
-            <w:r>
-              <w:rPr>
-                <w:sz w:val="20"/>
-                <w:szCs w:val="20"/>
-              </w:rPr>
-              <w:t>Mid)</w:t>
+              <w:t>Bands 7–8  (Mid)</w:t>
             </w:r>
           </w:p>
         </w:tc>
@@ -7317,23 +6566,7 @@
                 <w:sz w:val="20"/>
                 <w:szCs w:val="20"/>
               </w:rPr>
-              <w:t>Bands 9–</w:t>
-            </w:r>
-            <w:proofErr w:type="gramStart"/>
-            <w:r>
-              <w:rPr>
-                <w:sz w:val="20"/>
-                <w:szCs w:val="20"/>
-              </w:rPr>
-              <w:t>10  (</w:t>
-            </w:r>
-            <w:proofErr w:type="gramEnd"/>
-            <w:r>
-              <w:rPr>
-                <w:sz w:val="20"/>
-                <w:szCs w:val="20"/>
-              </w:rPr>
-              <w:t>Least Deprived)</w:t>
+              <w:t>Bands 9–10  (Least Deprived)</w:t>
             </w:r>
           </w:p>
         </w:tc>
@@ -7476,7 +6709,13 @@
         <w:spacing w:before="80" w:after="100"/>
       </w:pPr>
       <w:r>
-        <w:t>Three observations temper a strong conclusion here. First, the sample sizes per band are small (4–7 areas), making averages sensitive to individual outliers. Second, the min-to-max ranges are very wide — particularly in bands 7–8 and 9–10 (both ranging from ~3% to 11%) — suggesting that the average is not representative of the typical area within each band. Third, the deprivation join is a text-based approximation (see Limitations, Section 5), introducing imprecision.</w:t>
+        <w:t>Three observations temper a strong conclusion here. First, the sample sizes per band are small (4–7 areas), making averages sensitive to individual outliers. Second, the min-to-max ranges are very wide — particularly in bands 7–8 and 9–10 (both ranging from ~3% to 11%)</w:t>
+      </w:r>
+      <w:r>
+        <w:t>,</w:t>
+      </w:r>
+      <w:r>
+        <w:t xml:space="preserve"> suggesting that the average is not representative of the typical area within each band. Third, the deprivation join is a text-based approximation (see Limitations, Section 5), introducing imprecision.</w:t>
       </w:r>
     </w:p>
     <w:p>
@@ -7484,39 +6723,19 @@
         <w:spacing w:before="80" w:after="100"/>
       </w:pPr>
       <w:r>
-        <w:t xml:space="preserve">What the data does clearly show is that deprivation cannot </w:t>
-      </w:r>
-      <w:proofErr w:type="gramStart"/>
-      <w:r>
-        <w:t>be used</w:t>
-      </w:r>
-      <w:proofErr w:type="gramEnd"/>
-      <w:r>
-        <w:t xml:space="preserve"> as a </w:t>
-      </w:r>
-      <w:proofErr w:type="gramStart"/>
-      <w:r>
-        <w:t>reliable</w:t>
-      </w:r>
-      <w:proofErr w:type="gramEnd"/>
-      <w:r>
-        <w:t xml:space="preserve"> proxy for identifying high-DNA Sub-ICBs. The highest-DNA Sub-ICBs (London, </w:t>
-      </w:r>
-      <w:proofErr w:type="gramStart"/>
-      <w:r>
-        <w:t>North West</w:t>
-      </w:r>
-      <w:proofErr w:type="gramEnd"/>
-      <w:r>
-        <w:t xml:space="preserve">) are not the most deprived, and </w:t>
-      </w:r>
-      <w:proofErr w:type="gramStart"/>
-      <w:r>
-        <w:t>some of</w:t>
-      </w:r>
-      <w:proofErr w:type="gramEnd"/>
-      <w:r>
-        <w:t xml:space="preserve"> the best performers are in areas of mixed deprivation. Commissioners should treat this as a prompt for more granular investigation — controlling for mode mix, urban/rural classification, and practice-level variation — rather than as confirmation of an access inequality narrative.</w:t>
+        <w:t>What the data does clearly show is that deprivation cannot be used as a reliable proxy for identifying high-DNA Sub-ICBs. The highest-DNA Sub-ICBs (London, North West) are not the most deprived, and some of the best performers are in areas of mixed deprivation. Commissioners should treat this as a prompt for more granular investigation</w:t>
+      </w:r>
+      <w:r>
+        <w:t>,</w:t>
+      </w:r>
+      <w:r>
+        <w:t xml:space="preserve"> controlling for mode mix, urban/rural classification, and practice-level variation</w:t>
+      </w:r>
+      <w:r>
+        <w:t>,</w:t>
+      </w:r>
+      <w:r>
+        <w:t xml:space="preserve"> rather than as confirmation of an access inequality narrative.</w:t>
       </w:r>
     </w:p>
     <w:p>
@@ -7553,27 +6772,13 @@
         <w:spacing w:before="60" w:after="60"/>
       </w:pPr>
       <w:r>
-        <w:rPr>
-          <w:b/>
-          <w:bCs/>
-        </w:rPr>
-        <w:t xml:space="preserve">The Sub-ICB level data covers appointments recorded through Primary Care Network hub systems rather than all GP practice appointment systems. The geographic analysis may not represent all GP appointments in each Sub-ICB area. The national trend analysis uses the broader GP practice-level National Overview dataset (30 months, July 2022 – December 2024), which provides greater </w:t>
-      </w:r>
-      <w:proofErr w:type="spellStart"/>
-      <w:r>
-        <w:rPr>
-          <w:b/>
-          <w:bCs/>
-        </w:rPr>
-        <w:t>coverage.</w:t>
-      </w:r>
-      <w:r>
-        <w:t>PCN</w:t>
-      </w:r>
-      <w:proofErr w:type="spellEnd"/>
-      <w:r>
-        <w:t xml:space="preserve"> vs GP Practice Systems: </w:t>
-      </w:r>
+        <w:t xml:space="preserve">The Sub-ICB level data covers appointments recorded through Primary Care Network hub systems rather than all GP practice appointment systems. The geographic analysis may not represent all GP appointments in each Sub-ICB area. The national trend analysis uses the broader GP practice-level National Overview dataset (30 months, July 2022 – December 2024), which provides greater coverage. </w:t>
+      </w:r>
+    </w:p>
+    <w:p>
+      <w:pPr>
+        <w:spacing w:before="60" w:after="60"/>
+      </w:pPr>
     </w:p>
     <w:p>
       <w:pPr>
@@ -7585,29 +6790,18 @@
         <w:spacing w:before="60" w:after="60"/>
       </w:pPr>
       <w:r>
-        <w:rPr>
-          <w:b/>
-          <w:bCs/>
-        </w:rPr>
-        <w:t xml:space="preserve">The deprivation analysis joins Sub-ICB DNA rates to Local Authority level IMD scores using a text-based name match. This is an approximation — Sub-ICB and Local Authority boundaries do not map perfectly. A more precise analysis would use an NHS-published LSOA-to-Sub-ICB lookup </w:t>
-      </w:r>
-      <w:proofErr w:type="spellStart"/>
-      <w:proofErr w:type="gramStart"/>
-      <w:r>
-        <w:rPr>
-          <w:b/>
-          <w:bCs/>
-        </w:rPr>
-        <w:t>table.</w:t>
-      </w:r>
-      <w:r>
-        <w:t>Geographic</w:t>
-      </w:r>
-      <w:proofErr w:type="spellEnd"/>
-      <w:proofErr w:type="gramEnd"/>
-      <w:r>
-        <w:t xml:space="preserve"> Join Approximation: </w:t>
-      </w:r>
+        <w:t>The deprivation analysis joins Sub-ICB DNA rates to Local Authority level IMD scores using a text-based name match. This is an approximation — Sub-ICB and Local Authority boundaries do not map perfectly. A more precise analysis would use an NHS-published LSOA-to-Sub-ICB lookup table.</w:t>
+      </w:r>
+    </w:p>
+    <w:p>
+      <w:pPr>
+        <w:pStyle w:val="ListParagraph"/>
+      </w:pPr>
+    </w:p>
+    <w:p>
+      <w:pPr>
+        <w:spacing w:before="60" w:after="60"/>
+      </w:pPr>
     </w:p>
     <w:p>
       <w:pPr>
@@ -7619,43 +6813,13 @@
         <w:spacing w:before="60" w:after="60"/>
       </w:pPr>
       <w:r>
-        <w:rPr>
-          <w:b/>
-          <w:bCs/>
-        </w:rPr>
-        <w:t xml:space="preserve">The deprivation data used is from the 2019 release. Socioeconomic conditions have shifted since then. A 2025 IMD release exists but </w:t>
-      </w:r>
-      <w:proofErr w:type="gramStart"/>
-      <w:r>
-        <w:rPr>
-          <w:b/>
-          <w:bCs/>
-        </w:rPr>
-        <w:t>is not yet consistently mapped</w:t>
-      </w:r>
-      <w:proofErr w:type="gramEnd"/>
-      <w:r>
-        <w:rPr>
-          <w:b/>
-          <w:bCs/>
-        </w:rPr>
-        <w:t xml:space="preserve"> to the Sub-ICB geography used </w:t>
-      </w:r>
-      <w:proofErr w:type="spellStart"/>
-      <w:r>
-        <w:rPr>
-          <w:b/>
-          <w:bCs/>
-        </w:rPr>
-        <w:t>here.</w:t>
-      </w:r>
-      <w:r>
-        <w:t>IMD</w:t>
-      </w:r>
-      <w:proofErr w:type="spellEnd"/>
-      <w:r>
-        <w:t xml:space="preserve"> 2019 Currency: </w:t>
-      </w:r>
+        <w:t xml:space="preserve">The deprivation data used is from the 2019 release. Socioeconomic conditions have shifted since then. A 2025 IMD release exists but is not yet consistently mapped to the Sub-ICB geography used here. </w:t>
+      </w:r>
+    </w:p>
+    <w:p>
+      <w:pPr>
+        <w:spacing w:before="60" w:after="60"/>
+      </w:pPr>
     </w:p>
     <w:p>
       <w:pPr>
@@ -7667,44 +6831,20 @@
         <w:spacing w:before="60" w:after="60"/>
       </w:pPr>
       <w:r>
-        <w:rPr>
-          <w:b/>
-          <w:bCs/>
-        </w:rPr>
-        <w:t xml:space="preserve">All relationships identified are observational. This analysis does not control for confounding variables such as practice size, patient demographics, clinical speciality mix, or local reminder system quality. The mode-DNA </w:t>
-      </w:r>
-      <w:proofErr w:type="gramStart"/>
-      <w:r>
-        <w:rPr>
-          <w:b/>
-          <w:bCs/>
-        </w:rPr>
-        <w:t>relationship in particular, while</w:t>
-      </w:r>
-      <w:proofErr w:type="gramEnd"/>
-      <w:r>
-        <w:rPr>
-          <w:b/>
-          <w:bCs/>
-        </w:rPr>
-        <w:t xml:space="preserve"> strong and consistent, would benefit from a controlled study design before informing major commissioning </w:t>
-      </w:r>
-      <w:proofErr w:type="spellStart"/>
-      <w:proofErr w:type="gramStart"/>
-      <w:r>
-        <w:rPr>
-          <w:b/>
-          <w:bCs/>
-        </w:rPr>
-        <w:t>decisions.</w:t>
-      </w:r>
-      <w:r>
-        <w:t>Causation</w:t>
-      </w:r>
-      <w:proofErr w:type="spellEnd"/>
-      <w:proofErr w:type="gramEnd"/>
-      <w:r>
-        <w:t xml:space="preserve"> vs Correlation: </w:t>
+        <w:t>All relationships identified are observational. This analysis does not control for confounding variables such as practice size, patient demographics, clinical speciality mix, or local reminder system quality. The mode-DNA relationship in particular, while strong and consistent, would benefit from a controlled study design before informing major commissioning decisions.</w:t>
+      </w:r>
+    </w:p>
+    <w:p>
+      <w:pPr>
+        <w:pStyle w:val="ListParagraph"/>
+      </w:pPr>
+    </w:p>
+    <w:p>
+      <w:pPr>
+        <w:spacing w:before="60" w:after="60"/>
+      </w:pPr>
+      <w:r>
+        <w:t xml:space="preserve"> </w:t>
       </w:r>
     </w:p>
     <w:p>
@@ -7717,60 +6857,7 @@
         <w:spacing w:before="60" w:after="60"/>
       </w:pPr>
       <w:r>
-        <w:rPr>
-          <w:b/>
-          <w:bCs/>
-        </w:rPr>
-        <w:t xml:space="preserve">Two Sub-ICBs with 0.00% DNA rates have </w:t>
-      </w:r>
-      <w:proofErr w:type="gramStart"/>
-      <w:r>
-        <w:rPr>
-          <w:b/>
-          <w:bCs/>
-        </w:rPr>
-        <w:t>very low</w:t>
-      </w:r>
-      <w:proofErr w:type="gramEnd"/>
-      <w:r>
-        <w:rPr>
-          <w:b/>
-          <w:bCs/>
-        </w:rPr>
-        <w:t xml:space="preserve"> appointment volumes (12 and 275 appointments respectively), making their rates statistically unreliable. Similarly, the 32.84% rate in Staffordshire &amp; Stoke-on-Trent 05Q </w:t>
-      </w:r>
-      <w:proofErr w:type="gramStart"/>
-      <w:r>
-        <w:rPr>
-          <w:b/>
-          <w:bCs/>
-        </w:rPr>
-        <w:t>is derived</w:t>
-      </w:r>
-      <w:proofErr w:type="gramEnd"/>
-      <w:r>
-        <w:rPr>
-          <w:b/>
-          <w:bCs/>
-        </w:rPr>
-        <w:t xml:space="preserve"> from only 2,966 </w:t>
-      </w:r>
-      <w:proofErr w:type="spellStart"/>
-      <w:proofErr w:type="gramStart"/>
-      <w:r>
-        <w:rPr>
-          <w:b/>
-          <w:bCs/>
-        </w:rPr>
-        <w:t>appointments.</w:t>
-      </w:r>
-      <w:r>
-        <w:t>Outlier</w:t>
-      </w:r>
-      <w:proofErr w:type="spellEnd"/>
-      <w:proofErr w:type="gramEnd"/>
-      <w:r>
-        <w:t xml:space="preserve"> Sub-ICBs: </w:t>
+        <w:t xml:space="preserve">Two Sub-ICBs with 0.00% DNA rates have very low appointment volumes (12 and 275 appointments respectively), making their rates statistically unreliable. Similarly, the 32.84% rate in Staffordshire &amp; Stoke-on-Trent 05Q is derived from only 2,966 appointments. </w:t>
       </w:r>
     </w:p>
     <w:p>
@@ -7804,7 +6891,6 @@
         </w:pBdr>
         <w:spacing w:before="280" w:after="120"/>
       </w:pPr>
-      <w:proofErr w:type="gramStart"/>
       <w:r>
         <w:rPr>
           <w:b/>
@@ -7813,9 +6899,78 @@
           <w:sz w:val="24"/>
           <w:szCs w:val="24"/>
         </w:rPr>
-        <w:t>6.1  Accelerate</w:t>
-      </w:r>
-      <w:proofErr w:type="gramEnd"/>
+        <w:t>6.1  Accelerate the Shift to Lower-Friction Appointment Modes</w:t>
+      </w:r>
+    </w:p>
+    <w:p>
+      <w:pPr>
+        <w:spacing w:before="80" w:after="100"/>
+      </w:pPr>
+      <w:r>
+        <w:t>The most actionable finding in this analysis is the 5.5× gap in DNA rates between face-to-face (10.65%) and video/online appointments (1.94%). Every percentage point shift in mode mix from face-to-face toward telephone or digital has a directly measurable impact on DNA rates.</w:t>
+      </w:r>
+    </w:p>
+    <w:p>
+      <w:pPr>
+        <w:pStyle w:val="ListParagraph"/>
+        <w:numPr>
+          <w:ilvl w:val="0"/>
+          <w:numId w:val="2"/>
+        </w:numPr>
+        <w:spacing w:before="60" w:after="60"/>
+      </w:pPr>
+      <w:r>
+        <w:t>NHS commissioners should set explicit targets for video/online appointment share at Sub-ICB level, building on the existing growth trajectory (0.58% to 5.54% since 2022).</w:t>
+      </w:r>
+    </w:p>
+    <w:p>
+      <w:pPr>
+        <w:pStyle w:val="ListParagraph"/>
+        <w:numPr>
+          <w:ilvl w:val="0"/>
+          <w:numId w:val="2"/>
+        </w:numPr>
+        <w:spacing w:before="60" w:after="60"/>
+      </w:pPr>
+      <w:r>
+        <w:t>GP practices in high-DNA regions should be supported to expand telephone and video triage capacity, with particular focus on converting routine follow-up and review appointments to remote modes where clinically appropriate.</w:t>
+      </w:r>
+    </w:p>
+    <w:p>
+      <w:pPr>
+        <w:pStyle w:val="ListParagraph"/>
+        <w:numPr>
+          <w:ilvl w:val="0"/>
+          <w:numId w:val="2"/>
+        </w:numPr>
+        <w:spacing w:before="60" w:after="60"/>
+      </w:pPr>
+      <w:r>
+        <w:t>Patient-facing communications should actively normalise digital and telephone appointments, addressing any perception that face-to-face is a higher quality of care.</w:t>
+      </w:r>
+    </w:p>
+    <w:p>
+      <w:pPr>
+        <w:spacing w:before="80" w:after="100"/>
+      </w:pPr>
+      <w:r>
+        <w:rPr>
+          <w:b/>
+          <w:bCs/>
+        </w:rPr>
+        <w:t xml:space="preserve">Note: </w:t>
+      </w:r>
+      <w:r>
+        <w:t>This recommendation deliberately does not suggest moving patients 'away from face-to-face' as a catch-all. Clinical appropriateness must remain the primary allocation criterion. The recommendation is to expand the pathway for appointments that are clinically suitable for remote delivery.</w:t>
+      </w:r>
+    </w:p>
+    <w:p>
+      <w:pPr>
+        <w:pBdr>
+          <w:bottom w:val="single" w:sz="4" w:space="4" w:color="005EB8"/>
+        </w:pBdr>
+        <w:spacing w:before="280" w:after="120"/>
+      </w:pPr>
       <w:r>
         <w:rPr>
           <w:b/>
@@ -7824,7 +6979,7 @@
           <w:sz w:val="24"/>
           <w:szCs w:val="24"/>
         </w:rPr>
-        <w:t xml:space="preserve"> the Shift to Lower-Friction Appointment Modes</w:t>
+        <w:t>6.2  Target London and North West for Regional DNA Reduction Programmes</w:t>
       </w:r>
     </w:p>
     <w:p>
@@ -7832,7 +6987,7 @@
         <w:spacing w:before="80" w:after="100"/>
       </w:pPr>
       <w:r>
-        <w:t>The most actionable finding in this analysis is the 5.5× gap in DNA rates between face-to-face (10.65%) and video/online appointments (1.94%). Every percentage point shift in mode mix from face-to-face toward telephone or digital has a directly measurable impact on DNA rates.</w:t>
+        <w:t>London (12.15%) and North West (11.84%) together account for a disproportionate share of national DNAs. Within the North West, five of the ten worst Sub-ICBs are geographically concentrated — Greater Manchester, Lancashire, and Cheshire clusters — suggesting systemic regional factors rather than isolated GP-level issues.</w:t>
       </w:r>
     </w:p>
     <w:p>
@@ -7845,7 +7000,7 @@
         <w:spacing w:before="60" w:after="60"/>
       </w:pPr>
       <w:r>
-        <w:t>NHS commissioners should set explicit targets for video/online appointment share at Sub-ICB level, building on the existing growth trajectory (0.58% to 5.54% since 2022).</w:t>
+        <w:t>NHS England should commission a dedicated regional review in London and the North West, examining mode mix, practice-level reminder systems, appointment booking lead times, and demographic factors including transient and non-English speaking populations.</w:t>
       </w:r>
     </w:p>
     <w:p>
@@ -7858,15 +7013,7 @@
         <w:spacing w:before="60" w:after="60"/>
       </w:pPr>
       <w:r>
-        <w:t xml:space="preserve">GP practices in high-DNA regions should </w:t>
-      </w:r>
-      <w:proofErr w:type="gramStart"/>
-      <w:r>
-        <w:t>be supported</w:t>
-      </w:r>
-      <w:proofErr w:type="gramEnd"/>
-      <w:r>
-        <w:t xml:space="preserve"> to expand telephone and video triage capacity, with particular focus on converting routine follow-up and review appointments to remote modes where clinically appropriate.</w:t>
+        <w:t>Sub-ICBs in the top decile nationally should be required to produce DNA reduction plans with measurable targets, reviewed at quarterly ICB performance cycles.</w:t>
       </w:r>
     </w:p>
     <w:p>
@@ -7879,22 +7026,13 @@
         <w:spacing w:before="60" w:after="60"/>
       </w:pPr>
       <w:r>
-        <w:t>Patient-facing communications should actively normalise digital and telephone appointments, addressing any perception that face-to-face is a higher quality of care.</w:t>
-      </w:r>
-    </w:p>
-    <w:p>
-      <w:pPr>
-        <w:spacing w:before="80" w:after="100"/>
-      </w:pPr>
-      <w:r>
-        <w:rPr>
-          <w:b/>
-          <w:bCs/>
-        </w:rPr>
-        <w:t xml:space="preserve">Note: </w:t>
-      </w:r>
-      <w:r>
-        <w:t>This recommendation deliberately does not suggest moving patients 'away from face-to-face' as a catch-all. Clinical appropriateness must remain the primary allocation criterion. The recommendation is to expand the pathway for appointments that are clinically suitable for remote delivery.</w:t>
+        <w:t>Best-practice sharing between the lowest-performing and highest-performing Sub-ICBs should be facilitated</w:t>
+      </w:r>
+      <w:r>
+        <w:t>,</w:t>
+      </w:r>
+      <w:r>
+        <w:t xml:space="preserve"> particularly learning from the East of England (6.75% average, with several Sub-ICBs below 3.5%).</w:t>
       </w:r>
     </w:p>
     <w:p>
@@ -7904,7 +7042,6 @@
         </w:pBdr>
         <w:spacing w:before="280" w:after="120"/>
       </w:pPr>
-      <w:proofErr w:type="gramStart"/>
       <w:r>
         <w:rPr>
           <w:b/>
@@ -7913,40 +7050,7 @@
           <w:sz w:val="24"/>
           <w:szCs w:val="24"/>
         </w:rPr>
-        <w:t>6.2  Target</w:t>
-      </w:r>
-      <w:proofErr w:type="gramEnd"/>
-      <w:r>
-        <w:rPr>
-          <w:b/>
-          <w:bCs/>
-          <w:color w:val="003087"/>
-          <w:sz w:val="24"/>
-          <w:szCs w:val="24"/>
-        </w:rPr>
-        <w:t xml:space="preserve"> London and </w:t>
-      </w:r>
-      <w:proofErr w:type="gramStart"/>
-      <w:r>
-        <w:rPr>
-          <w:b/>
-          <w:bCs/>
-          <w:color w:val="003087"/>
-          <w:sz w:val="24"/>
-          <w:szCs w:val="24"/>
-        </w:rPr>
-        <w:t>North West</w:t>
-      </w:r>
-      <w:proofErr w:type="gramEnd"/>
-      <w:r>
-        <w:rPr>
-          <w:b/>
-          <w:bCs/>
-          <w:color w:val="003087"/>
-          <w:sz w:val="24"/>
-          <w:szCs w:val="24"/>
-        </w:rPr>
-        <w:t xml:space="preserve"> for Regional DNA Reduction Programmes</w:t>
+        <w:t>6.3  Commission a Controlled Deprivation Analysis Before Targeting Deprived Areas</w:t>
       </w:r>
     </w:p>
     <w:p>
@@ -7954,23 +7058,7 @@
         <w:spacing w:before="80" w:after="100"/>
       </w:pPr>
       <w:r>
-        <w:t xml:space="preserve">London (12.15%) and </w:t>
-      </w:r>
-      <w:proofErr w:type="gramStart"/>
-      <w:r>
-        <w:t>North West</w:t>
-      </w:r>
-      <w:proofErr w:type="gramEnd"/>
-      <w:r>
-        <w:t xml:space="preserve"> (11.84%) together account for a disproportionate share of national DNAs. Within the </w:t>
-      </w:r>
-      <w:proofErr w:type="gramStart"/>
-      <w:r>
-        <w:t>North West</w:t>
-      </w:r>
-      <w:proofErr w:type="gramEnd"/>
-      <w:r>
-        <w:t>, five of the ten worst Sub-ICBs are geographically concentrated — Greater Manchester, Lancashire, and Cheshire clusters — suggesting systemic regional factors rather than isolated GP-level issues.</w:t>
+        <w:t>The finding that deprivation does not reliably predict DNA rates at Sub-ICB level should be treated as a prompt to investigate further rather than to abandon the access inequality hypothesis entirely.</w:t>
       </w:r>
     </w:p>
     <w:p>
@@ -7983,15 +7071,19 @@
         <w:spacing w:before="60" w:after="60"/>
       </w:pPr>
       <w:r>
-        <w:t xml:space="preserve">NHS England should commission a dedicated regional review in London and the </w:t>
-      </w:r>
-      <w:proofErr w:type="gramStart"/>
-      <w:r>
-        <w:t>North West</w:t>
-      </w:r>
-      <w:proofErr w:type="gramEnd"/>
-      <w:r>
-        <w:t>, examining mode mix, practice-level reminder systems, appointment booking lead times, and demographic factors including transient and non-English speaking populations.</w:t>
+        <w:t>NHS England should commission a more granular deprivation analysis that controls for appointment mode mix, urban/rural classification, and practice size</w:t>
+      </w:r>
+      <w:r>
+        <w:t>.</w:t>
+      </w:r>
+      <w:r>
+        <w:t xml:space="preserve"> </w:t>
+      </w:r>
+      <w:r>
+        <w:t>T</w:t>
+      </w:r>
+      <w:r>
+        <w:t>he confounders most likely to be driving the counterintuitive pattern observed here.</w:t>
       </w:r>
     </w:p>
     <w:p>
@@ -8004,15 +7096,7 @@
         <w:spacing w:before="60" w:after="60"/>
       </w:pPr>
       <w:r>
-        <w:t xml:space="preserve">Sub-ICBs in the top decile nationally should </w:t>
-      </w:r>
-      <w:proofErr w:type="gramStart"/>
-      <w:r>
-        <w:t>be required</w:t>
-      </w:r>
-      <w:proofErr w:type="gramEnd"/>
-      <w:r>
-        <w:t xml:space="preserve"> to produce DNA reduction plans with measurable targets, reviewed at quarterly ICB performance cycles.</w:t>
+        <w:t>DNA rate disaggregated by IMD decile should be added to NHS England's routine primary care performance monitoring framework, but only once the mode-mix confounder is adequately controlled. Publishing raw DNA-by-deprivation data without this adjustment risks misdirecting commissioner attention toward deprived areas that are not the primary source of the problem.</w:t>
       </w:r>
     </w:p>
     <w:p>
@@ -8025,133 +7109,8 @@
         <w:spacing w:before="60" w:after="60"/>
       </w:pPr>
       <w:r>
-        <w:t xml:space="preserve">Best-practice sharing between the lowest-performing and highest-performing Sub-ICBs should </w:t>
-      </w:r>
-      <w:proofErr w:type="gramStart"/>
-      <w:r>
-        <w:t>be facilitated</w:t>
-      </w:r>
-      <w:proofErr w:type="gramEnd"/>
-      <w:r>
-        <w:t xml:space="preserve"> — particularly learning from the East of England (6.75% average, with </w:t>
-      </w:r>
-      <w:proofErr w:type="gramStart"/>
-      <w:r>
-        <w:t>several</w:t>
-      </w:r>
-      <w:proofErr w:type="gramEnd"/>
-      <w:r>
-        <w:t xml:space="preserve"> Sub-ICBs below 3.5%).</w:t>
-      </w:r>
-    </w:p>
-    <w:p>
-      <w:pPr>
-        <w:pBdr>
-          <w:bottom w:val="single" w:sz="4" w:space="4" w:color="005EB8"/>
-        </w:pBdr>
-        <w:spacing w:before="280" w:after="120"/>
-      </w:pPr>
-      <w:proofErr w:type="gramStart"/>
-      <w:r>
-        <w:rPr>
-          <w:b/>
-          <w:bCs/>
-          <w:color w:val="003087"/>
-          <w:sz w:val="24"/>
-          <w:szCs w:val="24"/>
-        </w:rPr>
-        <w:t>6.3  Commission</w:t>
-      </w:r>
-      <w:proofErr w:type="gramEnd"/>
-      <w:r>
-        <w:rPr>
-          <w:b/>
-          <w:bCs/>
-          <w:color w:val="003087"/>
-          <w:sz w:val="24"/>
-          <w:szCs w:val="24"/>
-        </w:rPr>
-        <w:t xml:space="preserve"> a Controlled Deprivation Analysis Before Targeting Deprived Areas</w:t>
-      </w:r>
-    </w:p>
-    <w:p>
-      <w:pPr>
-        <w:spacing w:before="80" w:after="100"/>
-      </w:pPr>
-      <w:r>
-        <w:t xml:space="preserve">The finding that deprivation does not reliably predict DNA rates at Sub-ICB level should </w:t>
-      </w:r>
-      <w:proofErr w:type="gramStart"/>
-      <w:r>
-        <w:t>be treated</w:t>
-      </w:r>
-      <w:proofErr w:type="gramEnd"/>
-      <w:r>
-        <w:t xml:space="preserve"> as a prompt to investigate further rather than to abandon the access inequality hypothesis entirely.</w:t>
-      </w:r>
-    </w:p>
-    <w:p>
-      <w:pPr>
-        <w:pStyle w:val="ListParagraph"/>
-        <w:numPr>
-          <w:ilvl w:val="0"/>
-          <w:numId w:val="2"/>
-        </w:numPr>
-        <w:spacing w:before="60" w:after="60"/>
-      </w:pPr>
-      <w:r>
-        <w:t>NHS England should commission a more granular deprivation analysis that controls for appointment mode mix, urban/rural classification, and practice size — the confounders most likely to be driving the counterintuitive pattern observed here.</w:t>
-      </w:r>
-    </w:p>
-    <w:p>
-      <w:pPr>
-        <w:pStyle w:val="ListParagraph"/>
-        <w:numPr>
-          <w:ilvl w:val="0"/>
-          <w:numId w:val="2"/>
-        </w:numPr>
-        <w:spacing w:before="60" w:after="60"/>
-      </w:pPr>
-      <w:r>
-        <w:t xml:space="preserve">DNA rate disaggregated by IMD decile should </w:t>
-      </w:r>
-      <w:proofErr w:type="gramStart"/>
-      <w:r>
-        <w:t>be added</w:t>
-      </w:r>
-      <w:proofErr w:type="gramEnd"/>
-      <w:r>
-        <w:t xml:space="preserve"> to NHS England's routine primary care performance monitoring framework, but only once the mode-mix confounder is adequately controlled. Publishing raw DNA-by-deprivation data without this adjustment risks misdirecting commissioner attention toward deprived areas that are not the primary source of the problem.</w:t>
-      </w:r>
-    </w:p>
-    <w:p>
-      <w:pPr>
-        <w:pStyle w:val="ListParagraph"/>
-        <w:numPr>
-          <w:ilvl w:val="0"/>
-          <w:numId w:val="2"/>
-        </w:numPr>
-        <w:spacing w:before="60" w:after="60"/>
-      </w:pPr>
-      <w:r>
         <w:lastRenderedPageBreak/>
-        <w:t xml:space="preserve">The current framing of DNA reduction as an 'access inequality' issue should be </w:t>
-      </w:r>
-      <w:proofErr w:type="gramStart"/>
-      <w:r>
-        <w:t>tested</w:t>
-      </w:r>
-      <w:proofErr w:type="gramEnd"/>
-      <w:r>
-        <w:t xml:space="preserve"> more rigorously. The data here suggests it may be better characterised as a 'friction and commitment' issue, with implications for how interventions </w:t>
-      </w:r>
-      <w:proofErr w:type="gramStart"/>
-      <w:r>
-        <w:t>are designed</w:t>
-      </w:r>
-      <w:proofErr w:type="gramEnd"/>
-      <w:r>
-        <w:t>.</w:t>
+        <w:t>The current framing of DNA reduction as an 'access inequality' issue should be tested more rigorously. The data here suggests it may be better characterised as a 'friction and commitment' issue, with implications for how interventions are designed.</w:t>
       </w:r>
     </w:p>
     <w:p>
@@ -8185,7 +7144,6 @@
         </w:pBdr>
         <w:spacing w:before="280" w:after="120"/>
       </w:pPr>
-      <w:proofErr w:type="gramStart"/>
       <w:r>
         <w:rPr>
           <w:b/>
@@ -8194,18 +7152,7 @@
           <w:sz w:val="24"/>
           <w:szCs w:val="24"/>
         </w:rPr>
-        <w:t>7.1  Skills</w:t>
-      </w:r>
-      <w:proofErr w:type="gramEnd"/>
-      <w:r>
-        <w:rPr>
-          <w:b/>
-          <w:bCs/>
-          <w:color w:val="003087"/>
-          <w:sz w:val="24"/>
-          <w:szCs w:val="24"/>
-        </w:rPr>
-        <w:t xml:space="preserve"> Demonstrated</w:t>
+        <w:t>7.1  Skills Demonstrated</w:t>
       </w:r>
     </w:p>
     <w:tbl>
@@ -9228,29 +8175,7 @@
           <w:sz w:val="19"/>
           <w:szCs w:val="19"/>
         </w:rPr>
-        <w:t xml:space="preserve">All datasets are publicly available, free to access, and published under the Open Government Licence v3.0. No patient-identifiable data </w:t>
-      </w:r>
-      <w:proofErr w:type="gramStart"/>
-      <w:r>
-        <w:rPr>
-          <w:i/>
-          <w:iCs/>
-          <w:color w:val="637381"/>
-          <w:sz w:val="19"/>
-          <w:szCs w:val="19"/>
-        </w:rPr>
-        <w:t>was used</w:t>
-      </w:r>
-      <w:proofErr w:type="gramEnd"/>
-      <w:r>
-        <w:rPr>
-          <w:i/>
-          <w:iCs/>
-          <w:color w:val="637381"/>
-          <w:sz w:val="19"/>
-          <w:szCs w:val="19"/>
-        </w:rPr>
-        <w:t xml:space="preserve"> at any stage of this project.</w:t>
+        <w:t>All datasets are publicly available, free to access, and published under the Open Government Licence v3.0. No patient-identifiable data was used at any stage of this project.</w:t>
       </w:r>
     </w:p>
     <w:sectPr>
@@ -9299,43 +8224,7 @@
         <w:sz w:val="18"/>
         <w:szCs w:val="18"/>
       </w:rPr>
-      <w:t>Google Data Analytics Certificate (</w:t>
-    </w:r>
-    <w:proofErr w:type="gramStart"/>
-    <w:r>
-      <w:rPr>
-        <w:color w:val="637381"/>
-        <w:sz w:val="18"/>
-        <w:szCs w:val="18"/>
-      </w:rPr>
-      <w:t>Coursera)  |</w:t>
-    </w:r>
-    <w:proofErr w:type="gramEnd"/>
-    <w:r>
-      <w:rPr>
-        <w:color w:val="637381"/>
-        <w:sz w:val="18"/>
-        <w:szCs w:val="18"/>
-      </w:rPr>
-      <w:t xml:space="preserve">  NHS England public </w:t>
-    </w:r>
-    <w:proofErr w:type="gramStart"/>
-    <w:r>
-      <w:rPr>
-        <w:color w:val="637381"/>
-        <w:sz w:val="18"/>
-        <w:szCs w:val="18"/>
-      </w:rPr>
-      <w:t>data  |</w:t>
-    </w:r>
-    <w:proofErr w:type="gramEnd"/>
-    <w:r>
-      <w:rPr>
-        <w:color w:val="637381"/>
-        <w:sz w:val="18"/>
-        <w:szCs w:val="18"/>
-      </w:rPr>
-      <w:t xml:space="preserve">  Open Government Licence v3.0</w:t>
+      <w:t>Google Data Analytics Certificate (Coursera)  |  NHS England public data  |  Open Government Licence v3.0</w:t>
     </w:r>
   </w:p>
 </w:ftr>
@@ -9377,25 +8266,7 @@
         <w:sz w:val="18"/>
         <w:szCs w:val="18"/>
       </w:rPr>
-      <w:t xml:space="preserve">NHS GP Appointment DNA </w:t>
-    </w:r>
-    <w:proofErr w:type="gramStart"/>
-    <w:r>
-      <w:rPr>
-        <w:color w:val="637381"/>
-        <w:sz w:val="18"/>
-        <w:szCs w:val="18"/>
-      </w:rPr>
-      <w:t>Analysis  |</w:t>
-    </w:r>
-    <w:proofErr w:type="gramEnd"/>
-    <w:r>
-      <w:rPr>
-        <w:color w:val="637381"/>
-        <w:sz w:val="18"/>
-        <w:szCs w:val="18"/>
-      </w:rPr>
-      <w:t xml:space="preserve">  Portfolio Case Study</w:t>
+      <w:t>NHS GP Appointment DNA Analysis  |  Portfolio Case Study</w:t>
     </w:r>
     <w:r>
       <w:rPr>
@@ -9410,25 +8281,7 @@
         <w:sz w:val="18"/>
         <w:szCs w:val="18"/>
       </w:rPr>
-      <w:t xml:space="preserve">David </w:t>
-    </w:r>
-    <w:proofErr w:type="gramStart"/>
-    <w:r>
-      <w:rPr>
-        <w:color w:val="637381"/>
-        <w:sz w:val="18"/>
-        <w:szCs w:val="18"/>
-      </w:rPr>
-      <w:t>Kamande  |</w:t>
-    </w:r>
-    <w:proofErr w:type="gramEnd"/>
-    <w:r>
-      <w:rPr>
-        <w:color w:val="637381"/>
-        <w:sz w:val="18"/>
-        <w:szCs w:val="18"/>
-      </w:rPr>
-      <w:t xml:space="preserve">  202</w:t>
+      <w:t>David Kamande  |  202</w:t>
     </w:r>
     <w:r>
       <w:rPr>

</xml_diff>